<commit_message>
docs: incorporate agreed MAX requirements and remove follow-up reminder
</commit_message>
<xml_diff>
--- a/install-guide/requirements/ЛТ_Пожелания_MAX_2026-10-28.docx
+++ b/install-guide/requirements/ЛТ_Пожелания_MAX_2026-10-28.docx
@@ -154,7 +154,7 @@
                 <w:sz w:val="22"/>
                 <w:b w:val="0"/>
               </w:rPr>
-              <w:t>29.10.2026</w:t>
+              <w:t/>
             </w:r>
           </w:p>
         </w:tc>
@@ -272,7 +272,7 @@
                 <w:sz w:val="22"/>
                 <w:b w:val="0"/>
               </w:rPr>
-              <w:t>Клиника «Медина»</w:t>
+              <w:t/>
             </w:r>
           </w:p>
         </w:tc>
@@ -307,7 +307,7 @@
                 <w:sz w:val="22"/>
                 <w:szCs w:val="22"/>
               </w:rPr>
-              <w:t>Страниц всего: 2</w:t>
+              <w:t>Страниц всего:  </w:t>
             </w:r>
           </w:p>
         </w:tc>
@@ -725,7 +725,7 @@
               <w:rPr>
                 <w:sz w:val="22"/>
               </w:rPr>
-              <w:t>Доработать MAX-бота клиники «Медина» и рабочее место «Единый чат» по пожеланиям от 14.10.2026. Состав работ включает шесть требований, приведённых ниже.</w:t>
+              <w:t>Доработать MAX-бота клиники «Медина» и рабочее место «Единый чат». Состав работ включает пять требований, приведённых ниже.</w:t>
             </w:r>
           </w:p>
           <w:p>
@@ -762,7 +762,7 @@
               <w:rPr>
                 <w:sz w:val="22"/>
               </w:rPr>
-              <w:t>Сделать границы соседних чатов в списке Единого чата более различимыми. Чёрная окантовка предложена заказчиком как возможный вариант оформления.</w:t>
+              <w:t>Добавить заметные разделители между соседними строками списка чатов и выделение выбранного чата.</w:t>
             </w:r>
           </w:p>
           <w:p>
@@ -774,7 +774,7 @@
                 <w:b/>
                 <w:sz w:val="22"/>
               </w:rPr>
-              <w:t>2. Редактирование и удаление сообщений администраторов</w:t>
+              <w:t>2. Редактирование и удаление текстовых сообщений</w:t>
             </w:r>
           </w:p>
           <w:p>
@@ -787,19 +787,7 @@
               <w:rPr>
                 <w:sz w:val="22"/>
               </w:rPr>
-              <w:t>Реализовать изменение текста и удаление отправленных администратором сообщений с отражением результата у пациента в MAX и в истории Единого чата.</w:t>
-            </w:r>
-          </w:p>
-          <w:p>
-            <w:pPr>
-              <w:spacing w:before="160" w:after="40"/>
-            </w:pPr>
-            <w:r>
-              <w:rPr>
-                <w:b/>
-                <w:sz w:val="22"/>
-              </w:rPr>
-              <w:t>3. Автоответ в нерабочее время</w:t>
+              <w:t>Реализовать изменение текста и удаление отправленных администратором текстовых сообщений с отражением результата у пациента в MAX и в истории Единого чата. Редактирование и удаление вложений в данный пункт не входит.</w:t>
             </w:r>
           </w:p>
           <w:p>
@@ -812,7 +800,19 @@
               <w:rPr>
                 <w:sz w:val="22"/>
               </w:rPr>
-              <w:t>При обращении вне рабочего времени клиники отправлять автоответ. Указанный заказчиком график: ежедневно с 8:00 до 20:00.</w:t>
+              <w:t>Не вводить собственное ограничение по давности сообщения. Сохранять историю изменений текста, автора и время изменения. Ограничения операций со стороны MAX обрабатывать с понятным уведомлением администратору.</w:t>
+            </w:r>
+          </w:p>
+          <w:p>
+            <w:pPr>
+              <w:spacing w:before="160" w:after="40"/>
+            </w:pPr>
+            <w:r>
+              <w:rPr>
+                <w:b/>
+                <w:sz w:val="22"/>
+              </w:rPr>
+              <w:t>3. Настраиваемый автоответ в нерабочее время</w:t>
             </w:r>
           </w:p>
           <w:p>
@@ -825,19 +825,7 @@
               <w:rPr>
                 <w:sz w:val="22"/>
               </w:rPr>
-              <w:t>Текст автоответа. «Здравствуйте! Вы написали в нерабочее время клиники. Наш график работы: ежедневно с 8:00 до 20:00. Ваше сообщение получено, администратор ответит вам в ближайший рабочий час».</w:t>
-            </w:r>
-          </w:p>
-          <w:p>
-            <w:pPr>
-              <w:spacing w:before="160" w:after="40"/>
-            </w:pPr>
-            <w:r>
-              <w:rPr>
-                <w:b/>
-                <w:sz w:val="22"/>
-              </w:rPr>
-              <w:t>4. Адрес клиники со ссылкой на Яндекс Карты</w:t>
+              <w:t>При обращении пациента вне рабочего времени отправлять автоответ. Рабочее время определять по времени сервера. Вынести график и включение автоответа в настройки; предусмотреть возможность полностью отключить функцию. Исходный график: ежедневно с 8:00 до 20:00.</w:t>
             </w:r>
           </w:p>
           <w:p>
@@ -850,7 +838,7 @@
               <w:rPr>
                 <w:sz w:val="22"/>
               </w:rPr>
-              <w:t>В сообщение о создании записи и в напоминания о визите добавить адрес клиники с кликабельной ссылкой на Яндекс Карты.</w:t>
+              <w:t>Текст автоответа: «Здравствуйте! Вы написали в нерабочее время клиники. Наш график работы: ежедневно с 8:00 до 20:00. Ваше сообщение получено, администратор ответит вам в ближайший рабочий час». Указанное в сообщении время должно соответствовать настроенному графику.</w:t>
             </w:r>
           </w:p>
           <w:p>
@@ -862,7 +850,7 @@
                 <w:b/>
                 <w:sz w:val="22"/>
               </w:rPr>
-              <w:t>5. Добавление записи в календарь пациента</w:t>
+              <w:t>4. Адрес филиала со ссылкой на Яндекс Карты</w:t>
             </w:r>
           </w:p>
           <w:p>
@@ -875,19 +863,7 @@
               <w:rPr>
                 <w:sz w:val="22"/>
               </w:rPr>
-              <w:t>Предоставить пациенту возможность добавить запись на приём в календарь своего устройства из сообщения бота. Исходное пожелание заказчика — чтобы запись сразу попадала в приложение календаря клиента.</w:t>
-            </w:r>
-          </w:p>
-          <w:p>
-            <w:pPr>
-              <w:spacing w:before="160" w:after="40"/>
-            </w:pPr>
-            <w:r>
-              <w:rPr>
-                <w:b/>
-                <w:sz w:val="22"/>
-              </w:rPr>
-              <w:t>6. Повторное напоминание при отсутствии подтверждения</w:t>
+              <w:t>Вынести в настройки выбор вида контактной информации для ссылки на Яндекс Карты. Ссылку выбранного вида хранить в контактной информации соответствующего филиала. Сотрудники клиники самостоятельно заполняют ссылки для филиалов.</w:t>
             </w:r>
           </w:p>
           <w:p>
@@ -900,7 +876,19 @@
               <w:rPr>
                 <w:sz w:val="22"/>
               </w:rPr>
-              <w:t>Если пациент не ответил на напоминание за сутки, отправлять дополнительное сообщение с предложением подтвердить или отменить визит.</w:t>
+              <w:t>В сообщение о создании записи и в напоминания о визите выводить адрес филиала, в котором назначен приём, и его кликабельную ссылку на Яндекс Карты.</w:t>
+            </w:r>
+          </w:p>
+          <w:p>
+            <w:pPr>
+              <w:spacing w:before="160" w:after="40"/>
+            </w:pPr>
+            <w:r>
+              <w:rPr>
+                <w:b/>
+                <w:sz w:val="22"/>
+              </w:rPr>
+              <w:t>5. Добавление записи в календарь пациента</w:t>
             </w:r>
           </w:p>
           <w:p>
@@ -913,7 +901,7 @@
               <w:rPr>
                 <w:sz w:val="22"/>
               </w:rPr>
-              <w:t>Текст сообщения. «{Имя}, вы не подтвердили визит к {Врач} на {Дата} в {Время}. Пожалуйста, подтвердите или отмените запись: 1 — приду, 2 — отменить».</w:t>
+              <w:t>Добавить в сообщение бота кнопку «Добавить в календарь». После нажатия пациент подтверждает сохранение события в календаре. Обеспечить работу сценария на Android и iPhone. Дату, время начала и длительность события брать из записи на приём; местом события указывать филиал приёма.</w:t>
             </w:r>
           </w:p>
           <w:p>
@@ -938,19 +926,7 @@
               <w:rPr>
                 <w:sz w:val="22"/>
               </w:rPr>
-              <w:t>Исправление ошибок сброса сценария, порядка выбора отделения и пациента, фильтров, повторных сообщений, определения ФИО и отправки сообщений; проверка существующих функций отмены и переноса записи; переименование отделения диагностики. Самостоятельный выбор пациентом нового времени приёма в этот лист не включён.</w:t>
-            </w:r>
-          </w:p>
-          <w:p>
-            <w:pPr>
-              <w:spacing w:before="180" w:after="60"/>
-            </w:pPr>
-            <w:r>
-              <w:rPr>
-                <w:b/>
-                <w:sz w:val="22"/>
-              </w:rPr>
-              <w:t>Способ реализации.</w:t>
+              <w:t>Повторное напоминание при отсутствии подтверждения визита. Автоматическое обновление или удаление уже добавленного события в календаре пациента при переносе или отмене приёма.</w:t>
             </w:r>
           </w:p>
           <w:p>
@@ -963,7 +939,7 @@
               <w:rPr>
                 <w:sz w:val="22"/>
               </w:rPr>
-              <w:t>Доработки выполняются в существующем расширении интеграции с MAX и настройках шаблонов сообщений. Способ добавления события в календарь определяется с учётом возможностей устройства пациента и необходимых разрешений.</w:t>
+              <w:t>Исправление ранее выявленных ошибок и проверка существующих функций отмены и переноса записи рассматриваются отдельно. Переименование отделения диагностики и самостоятельный выбор пациентом нового времени приёма в этот лист не включены.</w:t>
             </w:r>
           </w:p>
           <w:p>
@@ -975,7 +951,7 @@
                 <w:b/>
                 <w:sz w:val="22"/>
               </w:rPr>
-              <w:t>Критерии приемки.</w:t>
+              <w:t>Способ реализации.</w:t>
             </w:r>
           </w:p>
           <w:p>
@@ -988,7 +964,19 @@
               <w:rPr>
                 <w:sz w:val="22"/>
               </w:rPr>
-              <w:t>1. Администратор легко различает соседние строки, выбранный чат и отметки состояния диалога.</w:t>
+              <w:t>Доработки выполняются в существующем расширении интеграции с MAX и настройках шаблонов сообщений. При реализации автоответа проверить применимость типового регистра сведений «НастройкиРассылок» УМЦ: имеющиеся в нём границы ночного периода относятся к запрету отправки SMS. Повторно использовать типовые настройки, если их назначение и область действия соответствуют согласованному поведению автоответа.</w:t>
+            </w:r>
+          </w:p>
+          <w:p>
+            <w:pPr>
+              <w:spacing w:before="180" w:after="60"/>
+            </w:pPr>
+            <w:r>
+              <w:rPr>
+                <w:b/>
+                <w:sz w:val="22"/>
+              </w:rPr>
+              <w:t>Критерии приемки.</w:t>
             </w:r>
           </w:p>
           <w:p>
@@ -1001,7 +989,7 @@
               <w:rPr>
                 <w:sz w:val="22"/>
               </w:rPr>
-              <w:t>2. Результат операции корректно отображается у пациента в MAX и в истории Единого чата. При отказе операции администратор получает понятное сообщение.</w:t>
+              <w:t>1. В списке заметны границы соседних чатов, выбранный чат выделен.</w:t>
             </w:r>
           </w:p>
           <w:p>
@@ -1014,7 +1002,7 @@
               <w:rPr>
                 <w:sz w:val="22"/>
               </w:rPr>
-              <w:t>3. В нерабочее время пациент получает согласованный текст; в рабочее время такой ответ не отправляется.</w:t>
+              <w:t>2. Текстовое сообщение можно изменить или удалить в пределах возможностей MAX; результат отражается в обоих интерфейсах. Предыдущие версии текста, автор и время изменения доступны в истории. Собственного ограничения по давности нет; ошибки операций отображаются администратору.</w:t>
             </w:r>
           </w:p>
           <w:p>
@@ -1027,7 +1015,7 @@
               <w:rPr>
                 <w:sz w:val="22"/>
               </w:rPr>
-              <w:t>4. Пациент видит адрес места приёма и может открыть соответствующую клинику на карте из сообщения.</w:t>
+              <w:t>3. При включённой функции автоответ отправляется вне настроенного рабочего времени по часам сервера. В рабочее время и при отключённой функции автоответ не отправляется. Изменение графика учитывается без доработки программы.</w:t>
             </w:r>
           </w:p>
           <w:p>
@@ -1040,7 +1028,7 @@
               <w:rPr>
                 <w:sz w:val="22"/>
               </w:rPr>
-              <w:t>5. В календаре появляется событие с корректными датой, временем и местом приёма после действий или разрешений пациента, требуемых выбранным способом интеграции.</w:t>
+              <w:t>4. Сообщение содержит адрес и ссылку на карту филиала записи. При заполнении или изменении ссылки сотрудником новые сообщения используют актуальное значение.</w:t>
             </w:r>
           </w:p>
           <w:p>
@@ -1053,7 +1041,7 @@
               <w:rPr>
                 <w:sz w:val="22"/>
               </w:rPr>
-              <w:t>6. Подставлены данные конкретной записи. Дополнительное напоминание не отправляется по уже подтверждённому или отменённому визиту. Выбор пациента обрабатывается в рамках этой записи.</w:t>
+              <w:t>5. На Android и iPhone нажатие кнопки позволяет сохранить событие после подтверждения пациента. Дата, время, длительность и место совпадают с данными записи на приём.</w:t>
             </w:r>
           </w:p>
         </w:tc>

</xml_diff>

<commit_message>
docs: finalize message ownership and auto-reply requirements
</commit_message>
<xml_diff>
--- a/install-guide/requirements/ЛТ_Пожелания_MAX_2026-10-28.docx
+++ b/install-guide/requirements/ЛТ_Пожелания_MAX_2026-10-28.docx
@@ -787,7 +787,7 @@
               <w:rPr>
                 <w:sz w:val="22"/>
               </w:rPr>
-              <w:t>Реализовать изменение текста и удаление отправленных администратором текстовых сообщений с отражением результата у пациента в MAX и в истории Единого чата. Редактирование и удаление вложений в данный пункт не входит.</w:t>
+              <w:t>Реализовать изменение текста и удаление только собственных текстовых сообщений администратора с отражением результата у пациента в MAX и в истории Единого чата. Редактирование и удаление вложений в данный пункт не входит.</w:t>
             </w:r>
           </w:p>
           <w:p>
@@ -825,7 +825,7 @@
               <w:rPr>
                 <w:sz w:val="22"/>
               </w:rPr>
-              <w:t>При обращении пациента вне рабочего времени отправлять автоответ. Рабочее время определять по времени сервера. Вынести график и включение автоответа в настройки; предусмотреть возможность полностью отключить функцию. Исходный график: ежедневно с 8:00 до 20:00.</w:t>
+              <w:t>На каждое входящее сообщение пациента вне рабочего времени отправлять автоответ. Рабочее время определять по времени сервера. Вынести график и включение автоответа в настройки; предусмотреть возможность полностью отключить функцию. Исходный график: ежедневно с 8:00 до 20:00.</w:t>
             </w:r>
           </w:p>
           <w:p>
@@ -1002,7 +1002,7 @@
               <w:rPr>
                 <w:sz w:val="22"/>
               </w:rPr>
-              <w:t>2. Текстовое сообщение можно изменить или удалить в пределах возможностей MAX; результат отражается в обоих интерфейсах. Предыдущие версии текста, автор и время изменения доступны в истории. Собственного ограничения по давности нет; ошибки операций отображаются администратору.</w:t>
+              <w:t>2. Администратор может изменить или удалить только собственное текстовое сообщение в пределах возможностей MAX; изменение и удаление сообщений других администраторов недоступно; результат отражается в обоих интерфейсах. Предыдущие версии текста, автор и время изменения доступны в истории. Собственного ограничения по давности нет; ошибки операций отображаются администратору.</w:t>
             </w:r>
           </w:p>
           <w:p>
@@ -1015,7 +1015,7 @@
               <w:rPr>
                 <w:sz w:val="22"/>
               </w:rPr>
-              <w:t>3. При включённой функции автоответ отправляется вне настроенного рабочего времени по часам сервера. В рабочее время и при отключённой функции автоответ не отправляется. Изменение графика учитывается без доработки программы.</w:t>
+              <w:t>3. При включённой функции автоответ отправляется на каждое входящее сообщение пациента вне настроенного рабочего времени по часам сервера. В рабочее время и при отключённой функции автоответ не отправляется. Изменение графика учитывается без доработки программы.</w:t>
             </w:r>
           </w:p>
           <w:p>

</xml_diff>

<commit_message>
docs: describe schedule precedence in client-facing terms
</commit_message>
<xml_diff>
--- a/install-guide/requirements/ЛТ_Пожелания_MAX_2026-10-28.docx
+++ b/install-guide/requirements/ЛТ_Пожелания_MAX_2026-10-28.docx
@@ -1155,7 +1155,7 @@
               <w:rPr>
                 <w:sz w:val="22"/>
               </w:rPr>
-              <w:t>Для каждого филиала задавать основной недельный график: отдельные часы работы или выходной для каждого дня с понедельника по воскресенье. Предусмотреть временные графики, которые перекрывают основной на период своего действия, например на январские праздники. После окончания временного графика снова применяется основной.</w:t>
+              <w:t>Для каждого филиала задавать основной недельный график: часы работы или выходной для каждого дня с понедельника по воскресенье. Дни всегда отображаются в привычном порядке; состав и порядок строк не меняются. Если время начала и окончания не указано, день считается выходным и выделяется красным.</w:t>
             </w:r>
           </w:p>
           <w:p>
@@ -1170,7 +1170,7 @@
               <w:rPr>
                 <w:sz w:val="22"/>
               </w:rPr>
-              <w:t>Графики вводить документом «Установка графиков работы клиники». Обязательный реквизит «Филиал» заполняется через кнопку «Клиника», аналогично типовым документам. Реквизиты «Дата начала» и «Дата окончания» необязательные: незаполненная дата не ограничивает соответствующую границу действия; при обеих незаполненных датах график действует бессрочно.</w:t>
+              <w:t>Для праздников и других исключений можно задать временный график. Он заменяет основной на указанный период. Даты начала и окончания необязательны: незаполненная дата означает отсутствие ограничения с этой стороны; без обеих дат график действует бессрочно. Граничные даты включаются в период действия.</w:t>
             </w:r>
           </w:p>
           <w:p>
@@ -1185,7 +1185,7 @@
               <w:rPr>
                 <w:sz w:val="22"/>
               </w:rPr>
-              <w:t>Табличная часть документа всегда содержит семь строк в порядке с понедельника по воскресенье. Пользователь не может добавлять и удалять строки, менять их порядок или день недели. День недели хранится числом от 1 до 7, а пользователю отображается названием дня.</w:t>
+              <w:t>Вложенный период имеет приоритет: например, отдельные выходные внутри праздничного графика. После его окончания автоматически возвращается график более широкого периода, затем — основной.</w:t>
             </w:r>
           </w:p>
           <w:p>
@@ -1200,7 +1200,22 @@
               <w:rPr>
                 <w:sz w:val="22"/>
               </w:rPr>
-              <w:t>В каждой строке указываются время начала и время окончания работы. Если оба значения не заполнены, день считается выходным и выделяется красным условным оформлением. При проведении данные графика записываются в периодический регистр сведений «ГрафикиРаботыКлиники».</w:t>
+              <w:t>Пример: основной график — по будням с 08:00 до 20:00; на 1–15 января задан график с 10:00 до 19:00; на 1–3 января установлены выходные. Тогда 1–3 января клиника закрыта, 4–15 января работает с 10:00 до 19:00, а с 16 января возвращается к основному недельному графику.</w:t>
+            </w:r>
+          </w:p>
+          <w:p>
+            <w:pPr>
+              <w:pBdr/>
+              <w:spacing w:after="40" w:before="40"/>
+              <w:ind w:firstLine="283"/>
+              <w:jc w:val="both"/>
+              <w:rPr/>
+            </w:pPr>
+            <w:r>
+              <w:rPr>
+                <w:sz w:val="22"/>
+              </w:rPr>
+              <w:t>Временные периоды могут полностью входить один в другой. Частичное пересечение, например 1–15 и 10–20 января, не допускается: программа сообщает о конфликте и предлагает исправить даты. Если для одинакового периода сохранено несколько редакций графика, применяется редакция с более поздней датой; совпадение дат редакций требует устранения конфликта.</w:t>
             </w:r>
           </w:p>
           <w:p>
@@ -1466,7 +1481,7 @@
               <w:rPr>
                 <w:sz w:val="22"/>
               </w:rPr>
-              <w:t>Доработки выполняются в существующем расширении интеграции с MAX. Графики сохраняются в периодическом регистре «ГрафикиРаботыКлиники», подчинённом документу «Установка графиков работы клиники». Период записи равен дате документа; даты действия хранятся отдельно. Типовые ограничения отправки SMS не заменяют график филиала.</w:t>
+              <w:t>Сотрудники клиники самостоятельно изменяют графики и шаблоны сообщений в программе.</w:t>
             </w:r>
           </w:p>
           <w:p>
@@ -1550,7 +1565,7 @@
               <w:rPr>
                 <w:sz w:val="22"/>
               </w:rPr>
-              <w:t>В документе доступны ровно семь фиксированных строк дней недели. Для каждого дня можно указать собственные часы работы либо оставить оба времени пустыми и получить выходной с красным выделением. Проведение сохраняет график соответствующего филиала.</w:t>
+              <w:t>Для каждого филиала доступны семь дней недели с отдельными часами работы и выходными, выделенными красным. Графики разных филиалов применяются независимо.</w:t>
             </w:r>
           </w:p>
           <w:p>
@@ -1565,7 +1580,7 @@
               <w:rPr>
                 <w:sz w:val="22"/>
               </w:rPr>
-              <w:t>На период действия временного графика проверка рабочих часов и текст автоответа используют его вместо основного. После окончания периода автоматически применяется основной график. Изменения графиков учитываются без доработки программы.</w:t>
+              <w:t>Графики применяются по описанным выше правилам, включая пример с январскими праздниками. По окончании исключения автоматически возвращается более общий график. Программа не сохраняет конфликтующие периоды и объясняет причину.</w:t>
             </w:r>
           </w:p>
           <w:p>

</xml_diff>